<commit_message>
TIKA-4968: rename OMML span to class=omml; keep it across hyperlinks
</commit_message>
<xml_diff>
--- a/tika-parsers/tika-parsers-standard/tika-parsers-standard-modules/tika-parser-microsoft-module/src/test/resources/test-documents/testWORD_omml.docx
+++ b/tika-parsers/tika-parsers-standard/tika-parsers-standard-modules/tika-parser-microsoft-module/src/test/resources/test-documents/testWORD_omml.docx
@@ -64,6 +64,27 @@
         <w:t xml:space="preserve"> after</w:t>
       </w:r>
     </w:p>
+    <w:p>
+      <m:oMath>
+        <m:r>
+          <m:t>a</m:t>
+        </m:r>
+        <w:hyperlink w:anchor="eq">
+          <m:r>
+            <m:t>b</m:t>
+          </m:r>
+        </w:hyperlink>
+        <m:r>
+          <m:t>c</m:t>
+        </m:r>
+      </m:oMath>
+    </w:p>
+    <w:p>
+      <w:r>
+        <w:t>empty</w:t>
+      </w:r>
+      <m:oMath/>
+    </w:p>
   </w:body>
 </w:document>
 </file>
</xml_diff>

<commit_message>
TIKA-4968: rename OMML span to class=omml; keep it across hyperlinks (#3366)
</commit_message>
<xml_diff>
--- a/tika-parsers/tika-parsers-standard/tika-parsers-standard-modules/tika-parser-microsoft-module/src/test/resources/test-documents/testWORD_omml.docx
+++ b/tika-parsers/tika-parsers-standard/tika-parsers-standard-modules/tika-parser-microsoft-module/src/test/resources/test-documents/testWORD_omml.docx
@@ -64,6 +64,27 @@
         <w:t xml:space="preserve"> after</w:t>
       </w:r>
     </w:p>
+    <w:p>
+      <m:oMath>
+        <m:r>
+          <m:t>a</m:t>
+        </m:r>
+        <w:hyperlink w:anchor="eq">
+          <m:r>
+            <m:t>b</m:t>
+          </m:r>
+        </w:hyperlink>
+        <m:r>
+          <m:t>c</m:t>
+        </m:r>
+      </m:oMath>
+    </w:p>
+    <w:p>
+      <w:r>
+        <w:t>empty</w:t>
+      </w:r>
+      <m:oMath/>
+    </w:p>
   </w:body>
 </w:document>
 </file>
</xml_diff>